<commit_message>
feat(viceri-study): publish specification and test suite v1.5
</commit_message>
<xml_diff>
--- a/output/docx/AdministradorRealizaPickingDeEcommerce.docx
+++ b/output/docx/AdministradorRealizaPickingDeEcommerce.docx
@@ -13,7 +13,7 @@
           <w:sz w:val="40"/>
           <w:color w:val="1A365D"/>
         </w:rPr>
-        <w:t>Test Cases: Administrador Realiza Picking De Ecommerce</w:t>
+        <w:t>Test Cases: Administrador Registra Ocorrencia Em Nota De Coleta</w:t>
       </w:r>
     </w:p>
     <w:p>
@@ -39,7 +39,7 @@
           <w:sz w:val="30"/>
           <w:color w:val="1A365D"/>
         </w:rPr>
-        <w:t>Use Case: Administrador Realiza Picking De Ecommerce (v1.0)</w:t>
+        <w:t>Use Case: Administrador Registra Ocorrencia Em Nota De Coleta (v1.0)</w:t>
       </w:r>
     </w:p>
     <w:p>
@@ -106,7 +106,7 @@
         <w:rPr>
           <w:sz w:val="20"/>
         </w:rPr>
-        <w:t>O Picking diario foi realizado para o Ecommerce</w:t>
+        <w:t>A ocorrencia esta registrada e nota esta com status de ocorrencia registrada</w:t>
       </w:r>
     </w:p>
     <w:tbl>
@@ -197,17 +197,17 @@
               <w:rPr>
                 <w:sz w:val="18"/>
               </w:rPr>
-              <w:t>Administrador: clica na opcao 'Picking' no menu da tela principal</w:t>
-            </w:r>
-          </w:p>
-        </w:tc>
-        <w:tc>
-          <w:p>
-            <w:r>
-              <w:rPr>
-                <w:sz w:val="18"/>
-              </w:rPr>
-              <w:t>SYSTEM exibe lista de Ecommerces registrados no sistema</w:t>
+              <w:t>Administrador: clica na opcao 'Central de Operacoes' no menu da tela principal</w:t>
+            </w:r>
+          </w:p>
+        </w:tc>
+        <w:tc>
+          <w:p>
+            <w:r>
+              <w:rPr>
+                <w:sz w:val="18"/>
+              </w:rPr>
+              <w:t>SYSTEM exibe Dashboard do sistema</w:t>
             </w:r>
           </w:p>
         </w:tc>
@@ -229,17 +229,17 @@
               <w:rPr>
                 <w:sz w:val="18"/>
               </w:rPr>
-              <w:t>Administrador: clica em algum dos Ecommerces listados</w:t>
-            </w:r>
-          </w:p>
-        </w:tc>
-        <w:tc>
-          <w:p>
-            <w:r>
-              <w:rPr>
-                <w:sz w:val="18"/>
-              </w:rPr>
-              <w:t>SYSTEM abre uma tela com o Picking diario para aquele Ecommerce selecionado</w:t>
+              <w:t>Administrador: clica em contador 'Geradas' na secao de 'Coletas'</w:t>
+            </w:r>
+          </w:p>
+        </w:tc>
+        <w:tc>
+          <w:p>
+            <w:r>
+              <w:rPr>
+                <w:sz w:val="18"/>
+              </w:rPr>
+              <w:t>SYSTEM abre uma tela com as listas das 'Coletas'</w:t>
             </w:r>
           </w:p>
         </w:tc>
@@ -261,17 +261,17 @@
               <w:rPr>
                 <w:sz w:val="18"/>
               </w:rPr>
-              <w:t>Administrador: clica no botao 'Iniciar Picking'</w:t>
-            </w:r>
-          </w:p>
-        </w:tc>
-        <w:tc>
-          <w:p>
-            <w:r>
-              <w:rPr>
-                <w:sz w:val="18"/>
-              </w:rPr>
-              <w:t>SYSTEM exibe os dados do Picking</w:t>
+              <w:t>Administrador: seleciona alguma Coleta da lista</w:t>
+            </w:r>
+          </w:p>
+        </w:tc>
+        <w:tc>
+          <w:p>
+            <w:r>
+              <w:rPr>
+                <w:sz w:val="18"/>
+              </w:rPr>
+              <w:t>SYSTEM exibe os dados da Coleta</w:t>
             </w:r>
           </w:p>
         </w:tc>
@@ -293,17 +293,49 @@
               <w:rPr>
                 <w:sz w:val="18"/>
               </w:rPr>
-              <w:t>Administrador: clica no botao de 'Finalizar Picking'</w:t>
-            </w:r>
-          </w:p>
-        </w:tc>
-        <w:tc>
-          <w:p>
-            <w:r>
-              <w:rPr>
-                <w:sz w:val="18"/>
-              </w:rPr>
-              <w:t>SYSTEM notifica que Picking foi finalizado com sucesso e exibe Dashboard de sistema</w:t>
+              <w:t>Administrador: clica no botao de 'Registrar Ocorrencia' associado a qualquer item da nota</w:t>
+            </w:r>
+          </w:p>
+        </w:tc>
+        <w:tc>
+          <w:p>
+            <w:r>
+              <w:rPr>
+                <w:sz w:val="18"/>
+              </w:rPr>
+              <w:t>SYSTEM abre modal para digitacao da ocorrencia</w:t>
+            </w:r>
+          </w:p>
+        </w:tc>
+      </w:tr>
+      <w:tr>
+        <w:tc>
+          <w:p>
+            <w:r>
+              <w:rPr>
+                <w:sz w:val="18"/>
+              </w:rPr>
+              <w:t>5</w:t>
+            </w:r>
+          </w:p>
+        </w:tc>
+        <w:tc>
+          <w:p>
+            <w:r>
+              <w:rPr>
+                <w:sz w:val="18"/>
+              </w:rPr>
+              <w:t>Administrador: digita ocorrencia e clica em 'Confirmar'</w:t>
+            </w:r>
+          </w:p>
+        </w:tc>
+        <w:tc>
+          <w:p>
+            <w:r>
+              <w:rPr>
+                <w:sz w:val="18"/>
+              </w:rPr>
+              <w:t>SYSTEM notifica que Ocorrencia foi registrada com sucesso</w:t>
             </w:r>
           </w:p>
         </w:tc>
@@ -324,7 +356,7 @@
           <w:sz w:val="24"/>
           <w:color w:val="2B6CB0"/>
         </w:rPr>
-        <w:t>[TC2] Alternative Flow 1: Navega pelas paginas da lista</w:t>
+        <w:t>[TC2] Alternative Flow 1: Seleciona contador de 'Aguardando Picking'</w:t>
       </w:r>
     </w:p>
     <w:p>
@@ -360,7 +392,7 @@
         <w:rPr>
           <w:sz w:val="20"/>
         </w:rPr>
-        <w:t>O Picking diario foi realizado para o Ecommerce</w:t>
+        <w:t>A ocorrencia esta registrada e nota esta com status de ocorrencia registrada</w:t>
       </w:r>
     </w:p>
     <w:tbl>
@@ -451,17 +483,17 @@
               <w:rPr>
                 <w:sz w:val="18"/>
               </w:rPr>
-              <w:t>Administrador: clica na opcao 'Picking' no menu da tela principal</w:t>
-            </w:r>
-          </w:p>
-        </w:tc>
-        <w:tc>
-          <w:p>
-            <w:r>
-              <w:rPr>
-                <w:sz w:val="18"/>
-              </w:rPr>
-              <w:t>SYSTEM exibe lista de Ecommerces registrados no sistema</w:t>
+              <w:t>Administrador: clica na opcao 'Central de Operacoes' no menu da tela principal</w:t>
+            </w:r>
+          </w:p>
+        </w:tc>
+        <w:tc>
+          <w:p>
+            <w:r>
+              <w:rPr>
+                <w:sz w:val="18"/>
+              </w:rPr>
+              <w:t>SYSTEM exibe Dashboard do sistema</w:t>
             </w:r>
           </w:p>
         </w:tc>
@@ -483,17 +515,17 @@
               <w:rPr>
                 <w:sz w:val="18"/>
               </w:rPr>
-              <w:t>Administrador: seleciona outra pagina</w:t>
-            </w:r>
-          </w:p>
-        </w:tc>
-        <w:tc>
-          <w:p>
-            <w:r>
-              <w:rPr>
-                <w:sz w:val="18"/>
-              </w:rPr>
-              <w:t>SYSTEM exibe lista de Ecommerces registrados no sistema</w:t>
+              <w:t>Administrador: clica em algum contador de 'Aguardando Picking' na secao de 'Coletas'</w:t>
+            </w:r>
+          </w:p>
+        </w:tc>
+        <w:tc>
+          <w:p>
+            <w:r>
+              <w:rPr>
+                <w:sz w:val="18"/>
+              </w:rPr>
+              <w:t>SYSTEM abre uma tela com as listas das 'Coletas'</w:t>
             </w:r>
           </w:p>
         </w:tc>
@@ -515,17 +547,17 @@
               <w:rPr>
                 <w:sz w:val="18"/>
               </w:rPr>
-              <w:t>Administrador: clica em algum dos Ecommerces listados</w:t>
-            </w:r>
-          </w:p>
-        </w:tc>
-        <w:tc>
-          <w:p>
-            <w:r>
-              <w:rPr>
-                <w:sz w:val="18"/>
-              </w:rPr>
-              <w:t>SYSTEM abre uma tela com o Picking diario para aquele Ecommerce selecionado</w:t>
+              <w:t>Administrador: seleciona alguma Coleta da lista</w:t>
+            </w:r>
+          </w:p>
+        </w:tc>
+        <w:tc>
+          <w:p>
+            <w:r>
+              <w:rPr>
+                <w:sz w:val="18"/>
+              </w:rPr>
+              <w:t>SYSTEM exibe os dados da Coleta</w:t>
             </w:r>
           </w:p>
         </w:tc>
@@ -547,17 +579,17 @@
               <w:rPr>
                 <w:sz w:val="18"/>
               </w:rPr>
-              <w:t>Administrador: clica no botao 'Iniciar Picking'</w:t>
-            </w:r>
-          </w:p>
-        </w:tc>
-        <w:tc>
-          <w:p>
-            <w:r>
-              <w:rPr>
-                <w:sz w:val="18"/>
-              </w:rPr>
-              <w:t>SYSTEM exibe os dados do Picking</w:t>
+              <w:t>Administrador: clica no botao de 'Registrar Ocorrencia' associado a qualquer item da nota</w:t>
+            </w:r>
+          </w:p>
+        </w:tc>
+        <w:tc>
+          <w:p>
+            <w:r>
+              <w:rPr>
+                <w:sz w:val="18"/>
+              </w:rPr>
+              <w:t>SYSTEM abre modal para digitacao da ocorrencia</w:t>
             </w:r>
           </w:p>
         </w:tc>
@@ -579,17 +611,17 @@
               <w:rPr>
                 <w:sz w:val="18"/>
               </w:rPr>
-              <w:t>Administrador: clica no botao de 'Finalizar Picking'</w:t>
-            </w:r>
-          </w:p>
-        </w:tc>
-        <w:tc>
-          <w:p>
-            <w:r>
-              <w:rPr>
-                <w:sz w:val="18"/>
-              </w:rPr>
-              <w:t>SYSTEM notifica que Picking foi finalizado com sucesso e exibe Dashboard de sistema</w:t>
+              <w:t>Administrador: digita ocorrencia e clica em 'Confirmar'</w:t>
+            </w:r>
+          </w:p>
+        </w:tc>
+        <w:tc>
+          <w:p>
+            <w:r>
+              <w:rPr>
+                <w:sz w:val="18"/>
+              </w:rPr>
+              <w:t>SYSTEM notifica que Ocorrencia foi registrada com sucesso</w:t>
             </w:r>
           </w:p>
         </w:tc>
@@ -610,7 +642,7 @@
           <w:sz w:val="24"/>
           <w:color w:val="2B6CB0"/>
         </w:rPr>
-        <w:t>[TC3] Alternative Flow 2: Clica no botao 'Voltar'</w:t>
+        <w:t>[TC3] Alternative Flow 2: Seleciona contador de 'Aceitas'</w:t>
       </w:r>
     </w:p>
     <w:p>
@@ -646,7 +678,7 @@
         <w:rPr>
           <w:sz w:val="20"/>
         </w:rPr>
-        <w:t>O Picking diario foi realizado para o Ecommerce</w:t>
+        <w:t>A ocorrencia esta registrada e nota esta com status de ocorrencia registrada</w:t>
       </w:r>
     </w:p>
     <w:tbl>
@@ -737,17 +769,17 @@
               <w:rPr>
                 <w:sz w:val="18"/>
               </w:rPr>
-              <w:t>Administrador: clica na opcao 'Picking' no menu da tela principal</w:t>
-            </w:r>
-          </w:p>
-        </w:tc>
-        <w:tc>
-          <w:p>
-            <w:r>
-              <w:rPr>
-                <w:sz w:val="18"/>
-              </w:rPr>
-              <w:t>SYSTEM exibe lista de Ecommerces registrados no sistema</w:t>
+              <w:t>Administrador: clica na opcao 'Central de Operacoes' no menu da tela principal</w:t>
+            </w:r>
+          </w:p>
+        </w:tc>
+        <w:tc>
+          <w:p>
+            <w:r>
+              <w:rPr>
+                <w:sz w:val="18"/>
+              </w:rPr>
+              <w:t>SYSTEM exibe Dashboard do sistema</w:t>
             </w:r>
           </w:p>
         </w:tc>
@@ -769,17 +801,17 @@
               <w:rPr>
                 <w:sz w:val="18"/>
               </w:rPr>
-              <w:t>Administrador: clica no botao 'Voltar'</w:t>
-            </w:r>
-          </w:p>
-        </w:tc>
-        <w:tc>
-          <w:p>
-            <w:r>
-              <w:rPr>
-                <w:sz w:val="18"/>
-              </w:rPr>
-              <w:t>SYSTEM exibe lista de Ecommerces registrados no sistema</w:t>
+              <w:t>Administrador: clica em algum contador de 'Aceitas' na secao de 'Coletas'</w:t>
+            </w:r>
+          </w:p>
+        </w:tc>
+        <w:tc>
+          <w:p>
+            <w:r>
+              <w:rPr>
+                <w:sz w:val="18"/>
+              </w:rPr>
+              <w:t>SYSTEM abre uma tela com as listas das 'Coletas'</w:t>
             </w:r>
           </w:p>
         </w:tc>
@@ -801,17 +833,17 @@
               <w:rPr>
                 <w:sz w:val="18"/>
               </w:rPr>
-              <w:t>Administrador: clica em algum dos Ecommerces listados</w:t>
-            </w:r>
-          </w:p>
-        </w:tc>
-        <w:tc>
-          <w:p>
-            <w:r>
-              <w:rPr>
-                <w:sz w:val="18"/>
-              </w:rPr>
-              <w:t>SYSTEM abre uma tela com o Picking diario para aquele Ecommerce selecionado</w:t>
+              <w:t>Administrador: seleciona alguma Coleta da lista</w:t>
+            </w:r>
+          </w:p>
+        </w:tc>
+        <w:tc>
+          <w:p>
+            <w:r>
+              <w:rPr>
+                <w:sz w:val="18"/>
+              </w:rPr>
+              <w:t>SYSTEM exibe os dados da Coleta</w:t>
             </w:r>
           </w:p>
         </w:tc>
@@ -833,17 +865,17 @@
               <w:rPr>
                 <w:sz w:val="18"/>
               </w:rPr>
-              <w:t>Administrador: clica no botao 'Iniciar Picking'</w:t>
-            </w:r>
-          </w:p>
-        </w:tc>
-        <w:tc>
-          <w:p>
-            <w:r>
-              <w:rPr>
-                <w:sz w:val="18"/>
-              </w:rPr>
-              <w:t>SYSTEM exibe os dados do Picking</w:t>
+              <w:t>Administrador: clica no botao de 'Registrar Ocorrencia' associado a qualquer item da nota</w:t>
+            </w:r>
+          </w:p>
+        </w:tc>
+        <w:tc>
+          <w:p>
+            <w:r>
+              <w:rPr>
+                <w:sz w:val="18"/>
+              </w:rPr>
+              <w:t>SYSTEM abre modal para digitacao da ocorrencia</w:t>
             </w:r>
           </w:p>
         </w:tc>
@@ -865,17 +897,17 @@
               <w:rPr>
                 <w:sz w:val="18"/>
               </w:rPr>
-              <w:t>Administrador: clica no botao de 'Finalizar Picking'</w:t>
-            </w:r>
-          </w:p>
-        </w:tc>
-        <w:tc>
-          <w:p>
-            <w:r>
-              <w:rPr>
-                <w:sz w:val="18"/>
-              </w:rPr>
-              <w:t>SYSTEM notifica que Picking foi finalizado com sucesso e exibe Dashboard de sistema</w:t>
+              <w:t>Administrador: digita ocorrencia e clica em 'Confirmar'</w:t>
+            </w:r>
+          </w:p>
+        </w:tc>
+        <w:tc>
+          <w:p>
+            <w:r>
+              <w:rPr>
+                <w:sz w:val="18"/>
+              </w:rPr>
+              <w:t>SYSTEM notifica que Ocorrencia foi registrada com sucesso</w:t>
             </w:r>
           </w:p>
         </w:tc>
@@ -896,7 +928,7 @@
           <w:sz w:val="24"/>
           <w:color w:val="2B6CB0"/>
         </w:rPr>
-        <w:t>[TC4] Alternative Flow 3: Ordena os Ecommerces</w:t>
+        <w:t>[TC4] Alternative Flow 3: Seleciona contador de 'Recusadas'</w:t>
       </w:r>
     </w:p>
     <w:p>
@@ -932,7 +964,7 @@
         <w:rPr>
           <w:sz w:val="20"/>
         </w:rPr>
-        <w:t>O Picking diario foi realizado para o Ecommerce</w:t>
+        <w:t>A ocorrencia esta registrada e nota esta com status de ocorrencia registrada</w:t>
       </w:r>
     </w:p>
     <w:tbl>
@@ -1023,17 +1055,17 @@
               <w:rPr>
                 <w:sz w:val="18"/>
               </w:rPr>
-              <w:t>Administrador: clica na opcao 'Picking' no menu da tela principal</w:t>
-            </w:r>
-          </w:p>
-        </w:tc>
-        <w:tc>
-          <w:p>
-            <w:r>
-              <w:rPr>
-                <w:sz w:val="18"/>
-              </w:rPr>
-              <w:t>SYSTEM exibe lista de Ecommerces registrados no sistema</w:t>
+              <w:t>Administrador: clica na opcao 'Central de Operacoes' no menu da tela principal</w:t>
+            </w:r>
+          </w:p>
+        </w:tc>
+        <w:tc>
+          <w:p>
+            <w:r>
+              <w:rPr>
+                <w:sz w:val="18"/>
+              </w:rPr>
+              <w:t>SYSTEM exibe Dashboard do sistema</w:t>
             </w:r>
           </w:p>
         </w:tc>
@@ -1055,17 +1087,17 @@
               <w:rPr>
                 <w:sz w:val="18"/>
               </w:rPr>
-              <w:t>Administrador: ordena os Ecommerces por alguma coluna</w:t>
-            </w:r>
-          </w:p>
-        </w:tc>
-        <w:tc>
-          <w:p>
-            <w:r>
-              <w:rPr>
-                <w:sz w:val="18"/>
-              </w:rPr>
-              <w:t>SYSTEM exibe lista de Ecommerces registrados no sistema</w:t>
+              <w:t>Administrador: clica em algum contador de 'Recusadas' na secao de 'Coletas'</w:t>
+            </w:r>
+          </w:p>
+        </w:tc>
+        <w:tc>
+          <w:p>
+            <w:r>
+              <w:rPr>
+                <w:sz w:val="18"/>
+              </w:rPr>
+              <w:t>SYSTEM abre uma tela com as listas das 'Coletas'</w:t>
             </w:r>
           </w:p>
         </w:tc>
@@ -1087,17 +1119,17 @@
               <w:rPr>
                 <w:sz w:val="18"/>
               </w:rPr>
-              <w:t>Administrador: clica em algum dos Ecommerces listados</w:t>
-            </w:r>
-          </w:p>
-        </w:tc>
-        <w:tc>
-          <w:p>
-            <w:r>
-              <w:rPr>
-                <w:sz w:val="18"/>
-              </w:rPr>
-              <w:t>SYSTEM abre uma tela com o Picking diario para aquele Ecommerce selecionado</w:t>
+              <w:t>Administrador: seleciona alguma Coleta da lista</w:t>
+            </w:r>
+          </w:p>
+        </w:tc>
+        <w:tc>
+          <w:p>
+            <w:r>
+              <w:rPr>
+                <w:sz w:val="18"/>
+              </w:rPr>
+              <w:t>SYSTEM exibe os dados da Coleta</w:t>
             </w:r>
           </w:p>
         </w:tc>
@@ -1119,17 +1151,17 @@
               <w:rPr>
                 <w:sz w:val="18"/>
               </w:rPr>
-              <w:t>Administrador: clica no botao 'Iniciar Picking'</w:t>
-            </w:r>
-          </w:p>
-        </w:tc>
-        <w:tc>
-          <w:p>
-            <w:r>
-              <w:rPr>
-                <w:sz w:val="18"/>
-              </w:rPr>
-              <w:t>SYSTEM exibe os dados do Picking</w:t>
+              <w:t>Administrador: clica no botao de 'Registrar Ocorrencia' associado a qualquer item da nota</w:t>
+            </w:r>
+          </w:p>
+        </w:tc>
+        <w:tc>
+          <w:p>
+            <w:r>
+              <w:rPr>
+                <w:sz w:val="18"/>
+              </w:rPr>
+              <w:t>SYSTEM abre modal para digitacao da ocorrencia</w:t>
             </w:r>
           </w:p>
         </w:tc>
@@ -1151,17 +1183,17 @@
               <w:rPr>
                 <w:sz w:val="18"/>
               </w:rPr>
-              <w:t>Administrador: clica no botao de 'Finalizar Picking'</w:t>
-            </w:r>
-          </w:p>
-        </w:tc>
-        <w:tc>
-          <w:p>
-            <w:r>
-              <w:rPr>
-                <w:sz w:val="18"/>
-              </w:rPr>
-              <w:t>SYSTEM notifica que Picking foi finalizado com sucesso e exibe Dashboard de sistema</w:t>
+              <w:t>Administrador: digita ocorrencia e clica em 'Confirmar'</w:t>
+            </w:r>
+          </w:p>
+        </w:tc>
+        <w:tc>
+          <w:p>
+            <w:r>
+              <w:rPr>
+                <w:sz w:val="18"/>
+              </w:rPr>
+              <w:t>SYSTEM notifica que Ocorrencia foi registrada com sucesso</w:t>
             </w:r>
           </w:p>
         </w:tc>
@@ -1182,7 +1214,7 @@
           <w:sz w:val="24"/>
           <w:color w:val="2B6CB0"/>
         </w:rPr>
-        <w:t>[TC5] Alternative Flow 4: Filtra coletas da lista</w:t>
+        <w:t>[TC5] Alternative Flow 4: Seleciona contador de 'A Caminho'</w:t>
       </w:r>
     </w:p>
     <w:p>
@@ -1218,7 +1250,7 @@
         <w:rPr>
           <w:sz w:val="20"/>
         </w:rPr>
-        <w:t>O Picking diario foi realizado para o Ecommerce</w:t>
+        <w:t>A ocorrencia esta registrada e nota esta com status de ocorrencia registrada</w:t>
       </w:r>
     </w:p>
     <w:tbl>
@@ -1309,17 +1341,17 @@
               <w:rPr>
                 <w:sz w:val="18"/>
               </w:rPr>
-              <w:t>Administrador: clica na opcao 'Picking' no menu da tela principal</w:t>
-            </w:r>
-          </w:p>
-        </w:tc>
-        <w:tc>
-          <w:p>
-            <w:r>
-              <w:rPr>
-                <w:sz w:val="18"/>
-              </w:rPr>
-              <w:t>SYSTEM exibe lista de Ecommerces registrados no sistema</w:t>
+              <w:t>Administrador: clica na opcao 'Central de Operacoes' no menu da tela principal</w:t>
+            </w:r>
+          </w:p>
+        </w:tc>
+        <w:tc>
+          <w:p>
+            <w:r>
+              <w:rPr>
+                <w:sz w:val="18"/>
+              </w:rPr>
+              <w:t>SYSTEM exibe Dashboard do sistema</w:t>
             </w:r>
           </w:p>
         </w:tc>
@@ -1341,17 +1373,17 @@
               <w:rPr>
                 <w:sz w:val="18"/>
               </w:rPr>
-              <w:t>Administrador: filtra as coletas por algum campo</w:t>
-            </w:r>
-          </w:p>
-        </w:tc>
-        <w:tc>
-          <w:p>
-            <w:r>
-              <w:rPr>
-                <w:sz w:val="18"/>
-              </w:rPr>
-              <w:t>SYSTEM exibe lista de Ecommerces registrados no sistema</w:t>
+              <w:t>Administrador: clica em algum contador de 'A Caminho' na secao de 'Coletas'</w:t>
+            </w:r>
+          </w:p>
+        </w:tc>
+        <w:tc>
+          <w:p>
+            <w:r>
+              <w:rPr>
+                <w:sz w:val="18"/>
+              </w:rPr>
+              <w:t>SYSTEM abre uma tela com as listas das 'Coletas'</w:t>
             </w:r>
           </w:p>
         </w:tc>
@@ -1373,17 +1405,17 @@
               <w:rPr>
                 <w:sz w:val="18"/>
               </w:rPr>
-              <w:t>Administrador: clica em algum dos Ecommerces listados</w:t>
-            </w:r>
-          </w:p>
-        </w:tc>
-        <w:tc>
-          <w:p>
-            <w:r>
-              <w:rPr>
-                <w:sz w:val="18"/>
-              </w:rPr>
-              <w:t>SYSTEM abre uma tela com o Picking diario para aquele Ecommerce selecionado</w:t>
+              <w:t>Administrador: seleciona alguma Coleta da lista</w:t>
+            </w:r>
+          </w:p>
+        </w:tc>
+        <w:tc>
+          <w:p>
+            <w:r>
+              <w:rPr>
+                <w:sz w:val="18"/>
+              </w:rPr>
+              <w:t>SYSTEM exibe os dados da Coleta</w:t>
             </w:r>
           </w:p>
         </w:tc>
@@ -1405,17 +1437,17 @@
               <w:rPr>
                 <w:sz w:val="18"/>
               </w:rPr>
-              <w:t>Administrador: clica no botao 'Iniciar Picking'</w:t>
-            </w:r>
-          </w:p>
-        </w:tc>
-        <w:tc>
-          <w:p>
-            <w:r>
-              <w:rPr>
-                <w:sz w:val="18"/>
-              </w:rPr>
-              <w:t>SYSTEM exibe os dados do Picking</w:t>
+              <w:t>Administrador: clica no botao de 'Registrar Ocorrencia' associado a qualquer item da nota</w:t>
+            </w:r>
+          </w:p>
+        </w:tc>
+        <w:tc>
+          <w:p>
+            <w:r>
+              <w:rPr>
+                <w:sz w:val="18"/>
+              </w:rPr>
+              <w:t>SYSTEM abre modal para digitacao da ocorrencia</w:t>
             </w:r>
           </w:p>
         </w:tc>
@@ -1437,17 +1469,17 @@
               <w:rPr>
                 <w:sz w:val="18"/>
               </w:rPr>
-              <w:t>Administrador: clica no botao de 'Finalizar Picking'</w:t>
-            </w:r>
-          </w:p>
-        </w:tc>
-        <w:tc>
-          <w:p>
-            <w:r>
-              <w:rPr>
-                <w:sz w:val="18"/>
-              </w:rPr>
-              <w:t>SYSTEM notifica que Picking foi finalizado com sucesso e exibe Dashboard de sistema</w:t>
+              <w:t>Administrador: digita ocorrencia e clica em 'Confirmar'</w:t>
+            </w:r>
+          </w:p>
+        </w:tc>
+        <w:tc>
+          <w:p>
+            <w:r>
+              <w:rPr>
+                <w:sz w:val="18"/>
+              </w:rPr>
+              <w:t>SYSTEM notifica que Ocorrencia foi registrada com sucesso</w:t>
             </w:r>
           </w:p>
         </w:tc>
@@ -1468,7 +1500,7 @@
           <w:sz w:val="24"/>
           <w:color w:val="2B6CB0"/>
         </w:rPr>
-        <w:t>[TC6] Alternative Flow 5: Cancela realizacao de Picking</w:t>
+        <w:t>[TC6] Alternative Flow 5: Navega pelas paginas da lista</w:t>
       </w:r>
     </w:p>
     <w:p>
@@ -1504,7 +1536,7 @@
         <w:rPr>
           <w:sz w:val="20"/>
         </w:rPr>
-        <w:t>O Picking diario foi realizado para o Ecommerce</w:t>
+        <w:t>A ocorrencia esta registrada e nota esta com status de ocorrencia registrada</w:t>
       </w:r>
     </w:p>
     <w:tbl>
@@ -1595,17 +1627,17 @@
               <w:rPr>
                 <w:sz w:val="18"/>
               </w:rPr>
-              <w:t>Administrador: clica na opcao 'Picking' no menu da tela principal</w:t>
-            </w:r>
-          </w:p>
-        </w:tc>
-        <w:tc>
-          <w:p>
-            <w:r>
-              <w:rPr>
-                <w:sz w:val="18"/>
-              </w:rPr>
-              <w:t>SYSTEM exibe lista de Ecommerces registrados no sistema</w:t>
+              <w:t>Administrador: clica na opcao 'Central de Operacoes' no menu da tela principal</w:t>
+            </w:r>
+          </w:p>
+        </w:tc>
+        <w:tc>
+          <w:p>
+            <w:r>
+              <w:rPr>
+                <w:sz w:val="18"/>
+              </w:rPr>
+              <w:t>SYSTEM exibe Dashboard do sistema</w:t>
             </w:r>
           </w:p>
         </w:tc>
@@ -1627,17 +1659,17 @@
               <w:rPr>
                 <w:sz w:val="18"/>
               </w:rPr>
-              <w:t>Administrador: clica em algum dos Ecommerces listados</w:t>
-            </w:r>
-          </w:p>
-        </w:tc>
-        <w:tc>
-          <w:p>
-            <w:r>
-              <w:rPr>
-                <w:sz w:val="18"/>
-              </w:rPr>
-              <w:t>SYSTEM abre uma tela com o Picking diario para aquele Ecommerce selecionado</w:t>
+              <w:t>Administrador: clica em contador 'Geradas' na secao de 'Coletas'</w:t>
+            </w:r>
+          </w:p>
+        </w:tc>
+        <w:tc>
+          <w:p>
+            <w:r>
+              <w:rPr>
+                <w:sz w:val="18"/>
+              </w:rPr>
+              <w:t>SYSTEM abre uma tela com as listas das 'Coletas'</w:t>
             </w:r>
           </w:p>
         </w:tc>
@@ -1659,17 +1691,17 @@
               <w:rPr>
                 <w:sz w:val="18"/>
               </w:rPr>
-              <w:t>Administrador: clica em botao 'Cancelar'</w:t>
-            </w:r>
-          </w:p>
-        </w:tc>
-        <w:tc>
-          <w:p>
-            <w:r>
-              <w:rPr>
-                <w:sz w:val="18"/>
-              </w:rPr>
-              <w:t>SYSTEM exibe lista de Ecommerces registrados no sistema</w:t>
+              <w:t>Administrador: seleciona outra pagina</w:t>
+            </w:r>
+          </w:p>
+        </w:tc>
+        <w:tc>
+          <w:p>
+            <w:r>
+              <w:rPr>
+                <w:sz w:val="18"/>
+              </w:rPr>
+              <w:t>SYSTEM abre uma tela com as listas das 'Coletas'</w:t>
             </w:r>
           </w:p>
         </w:tc>
@@ -1691,17 +1723,17 @@
               <w:rPr>
                 <w:sz w:val="18"/>
               </w:rPr>
-              <w:t>Administrador: clica em algum dos Ecommerces listados</w:t>
-            </w:r>
-          </w:p>
-        </w:tc>
-        <w:tc>
-          <w:p>
-            <w:r>
-              <w:rPr>
-                <w:sz w:val="18"/>
-              </w:rPr>
-              <w:t>SYSTEM abre uma tela com o Picking diario para aquele Ecommerce selecionado</w:t>
+              <w:t>Administrador: seleciona alguma Coleta da lista</w:t>
+            </w:r>
+          </w:p>
+        </w:tc>
+        <w:tc>
+          <w:p>
+            <w:r>
+              <w:rPr>
+                <w:sz w:val="18"/>
+              </w:rPr>
+              <w:t>SYSTEM exibe os dados da Coleta</w:t>
             </w:r>
           </w:p>
         </w:tc>
@@ -1723,17 +1755,17 @@
               <w:rPr>
                 <w:sz w:val="18"/>
               </w:rPr>
-              <w:t>Administrador: clica no botao 'Iniciar Picking'</w:t>
-            </w:r>
-          </w:p>
-        </w:tc>
-        <w:tc>
-          <w:p>
-            <w:r>
-              <w:rPr>
-                <w:sz w:val="18"/>
-              </w:rPr>
-              <w:t>SYSTEM exibe os dados do Picking</w:t>
+              <w:t>Administrador: clica no botao de 'Registrar Ocorrencia' associado a qualquer item da nota</w:t>
+            </w:r>
+          </w:p>
+        </w:tc>
+        <w:tc>
+          <w:p>
+            <w:r>
+              <w:rPr>
+                <w:sz w:val="18"/>
+              </w:rPr>
+              <w:t>SYSTEM abre modal para digitacao da ocorrencia</w:t>
             </w:r>
           </w:p>
         </w:tc>
@@ -1755,17 +1787,17 @@
               <w:rPr>
                 <w:sz w:val="18"/>
               </w:rPr>
-              <w:t>Administrador: clica no botao de 'Finalizar Picking'</w:t>
-            </w:r>
-          </w:p>
-        </w:tc>
-        <w:tc>
-          <w:p>
-            <w:r>
-              <w:rPr>
-                <w:sz w:val="18"/>
-              </w:rPr>
-              <w:t>SYSTEM notifica que Picking foi finalizado com sucesso e exibe Dashboard de sistema</w:t>
+              <w:t>Administrador: digita ocorrencia e clica em 'Confirmar'</w:t>
+            </w:r>
+          </w:p>
+        </w:tc>
+        <w:tc>
+          <w:p>
+            <w:r>
+              <w:rPr>
+                <w:sz w:val="18"/>
+              </w:rPr>
+              <w:t>SYSTEM notifica que Ocorrencia foi registrada com sucesso</w:t>
             </w:r>
           </w:p>
         </w:tc>
@@ -1786,7 +1818,7 @@
           <w:sz w:val="24"/>
           <w:color w:val="2B6CB0"/>
         </w:rPr>
-        <w:t>[TC8] Alternative Flow 7: Clica no botao 'Proximo Picking'</w:t>
+        <w:t>[TC7] Alternative Flow 6: Clica no botao 'Voltar'</w:t>
       </w:r>
     </w:p>
     <w:p>
@@ -1822,7 +1854,7 @@
         <w:rPr>
           <w:sz w:val="20"/>
         </w:rPr>
-        <w:t>O Picking diario foi realizado para o Ecommerce</w:t>
+        <w:t>A ocorrencia esta registrada e nota esta com status de ocorrencia registrada</w:t>
       </w:r>
     </w:p>
     <w:tbl>
@@ -1913,17 +1945,17 @@
               <w:rPr>
                 <w:sz w:val="18"/>
               </w:rPr>
-              <w:t>Administrador: clica na opcao 'Picking' no menu da tela principal</w:t>
-            </w:r>
-          </w:p>
-        </w:tc>
-        <w:tc>
-          <w:p>
-            <w:r>
-              <w:rPr>
-                <w:sz w:val="18"/>
-              </w:rPr>
-              <w:t>SYSTEM exibe lista de Ecommerces registrados no sistema</w:t>
+              <w:t>Administrador: clica na opcao 'Central de Operacoes' no menu da tela principal</w:t>
+            </w:r>
+          </w:p>
+        </w:tc>
+        <w:tc>
+          <w:p>
+            <w:r>
+              <w:rPr>
+                <w:sz w:val="18"/>
+              </w:rPr>
+              <w:t>SYSTEM exibe Dashboard do sistema</w:t>
             </w:r>
           </w:p>
         </w:tc>
@@ -1945,17 +1977,17 @@
               <w:rPr>
                 <w:sz w:val="18"/>
               </w:rPr>
-              <w:t>Administrador: clica em algum dos Ecommerces listados</w:t>
-            </w:r>
-          </w:p>
-        </w:tc>
-        <w:tc>
-          <w:p>
-            <w:r>
-              <w:rPr>
-                <w:sz w:val="18"/>
-              </w:rPr>
-              <w:t>SYSTEM abre uma tela com o Picking diario para aquele Ecommerce selecionado</w:t>
+              <w:t>Administrador: clica em contador 'Geradas' na secao de 'Coletas'</w:t>
+            </w:r>
+          </w:p>
+        </w:tc>
+        <w:tc>
+          <w:p>
+            <w:r>
+              <w:rPr>
+                <w:sz w:val="18"/>
+              </w:rPr>
+              <w:t>SYSTEM abre uma tela com as listas das 'Coletas'</w:t>
             </w:r>
           </w:p>
         </w:tc>
@@ -1977,17 +2009,17 @@
               <w:rPr>
                 <w:sz w:val="18"/>
               </w:rPr>
-              <w:t>Administrador: clica no botao 'Iniciar Picking'</w:t>
-            </w:r>
-          </w:p>
-        </w:tc>
-        <w:tc>
-          <w:p>
-            <w:r>
-              <w:rPr>
-                <w:sz w:val="18"/>
-              </w:rPr>
-              <w:t>SYSTEM exibe os dados do Picking</w:t>
+              <w:t>Administrador: clica no botao 'Voltar'</w:t>
+            </w:r>
+          </w:p>
+        </w:tc>
+        <w:tc>
+          <w:p>
+            <w:r>
+              <w:rPr>
+                <w:sz w:val="18"/>
+              </w:rPr>
+              <w:t>SYSTEM exibe Dashboard do sistema</w:t>
             </w:r>
           </w:p>
         </w:tc>
@@ -2009,17 +2041,17 @@
               <w:rPr>
                 <w:sz w:val="18"/>
               </w:rPr>
-              <w:t>Administrador: clica no botao 'Proximo Picking'</w:t>
-            </w:r>
-          </w:p>
-        </w:tc>
-        <w:tc>
-          <w:p>
-            <w:r>
-              <w:rPr>
-                <w:sz w:val="18"/>
-              </w:rPr>
-              <w:t>SYSTEM exibe os dados do Picking</w:t>
+              <w:t>Administrador: clica em contador 'Geradas' na secao de 'Coletas'</w:t>
+            </w:r>
+          </w:p>
+        </w:tc>
+        <w:tc>
+          <w:p>
+            <w:r>
+              <w:rPr>
+                <w:sz w:val="18"/>
+              </w:rPr>
+              <w:t>SYSTEM abre uma tela com as listas das 'Coletas'</w:t>
             </w:r>
           </w:p>
         </w:tc>
@@ -2041,17 +2073,81 @@
               <w:rPr>
                 <w:sz w:val="18"/>
               </w:rPr>
-              <w:t>Administrador: clica no botao de 'Finalizar Picking'</w:t>
-            </w:r>
-          </w:p>
-        </w:tc>
-        <w:tc>
-          <w:p>
-            <w:r>
-              <w:rPr>
-                <w:sz w:val="18"/>
-              </w:rPr>
-              <w:t>SYSTEM notifica que Picking foi finalizado com sucesso e exibe Dashboard de sistema</w:t>
+              <w:t>Administrador: seleciona alguma Coleta da lista</w:t>
+            </w:r>
+          </w:p>
+        </w:tc>
+        <w:tc>
+          <w:p>
+            <w:r>
+              <w:rPr>
+                <w:sz w:val="18"/>
+              </w:rPr>
+              <w:t>SYSTEM exibe os dados da Coleta</w:t>
+            </w:r>
+          </w:p>
+        </w:tc>
+      </w:tr>
+      <w:tr>
+        <w:tc>
+          <w:p>
+            <w:r>
+              <w:rPr>
+                <w:sz w:val="18"/>
+              </w:rPr>
+              <w:t>6</w:t>
+            </w:r>
+          </w:p>
+        </w:tc>
+        <w:tc>
+          <w:p>
+            <w:r>
+              <w:rPr>
+                <w:sz w:val="18"/>
+              </w:rPr>
+              <w:t>Administrador: clica no botao de 'Registrar Ocorrencia' associado a qualquer item da nota</w:t>
+            </w:r>
+          </w:p>
+        </w:tc>
+        <w:tc>
+          <w:p>
+            <w:r>
+              <w:rPr>
+                <w:sz w:val="18"/>
+              </w:rPr>
+              <w:t>SYSTEM abre modal para digitacao da ocorrencia</w:t>
+            </w:r>
+          </w:p>
+        </w:tc>
+      </w:tr>
+      <w:tr>
+        <w:tc>
+          <w:p>
+            <w:r>
+              <w:rPr>
+                <w:sz w:val="18"/>
+              </w:rPr>
+              <w:t>7</w:t>
+            </w:r>
+          </w:p>
+        </w:tc>
+        <w:tc>
+          <w:p>
+            <w:r>
+              <w:rPr>
+                <w:sz w:val="18"/>
+              </w:rPr>
+              <w:t>Administrador: digita ocorrencia e clica em 'Confirmar'</w:t>
+            </w:r>
+          </w:p>
+        </w:tc>
+        <w:tc>
+          <w:p>
+            <w:r>
+              <w:rPr>
+                <w:sz w:val="18"/>
+              </w:rPr>
+              <w:t>SYSTEM notifica que Ocorrencia foi registrada com sucesso</w:t>
             </w:r>
           </w:p>
         </w:tc>
@@ -2072,7 +2168,7 @@
           <w:sz w:val="24"/>
           <w:color w:val="2B6CB0"/>
         </w:rPr>
-        <w:t>[TC9] Alternative Flow 8: realiza picking depois de consultar veiculos</w:t>
+        <w:t>[TC8] Alternative Flow 7: Ordena Coletas</w:t>
       </w:r>
     </w:p>
     <w:p>
@@ -2108,7 +2204,7 @@
         <w:rPr>
           <w:sz w:val="20"/>
         </w:rPr>
-        <w:t>O Picking diario foi realizado para o Ecommerce</w:t>
+        <w:t>A ocorrencia esta registrada e nota esta com status de ocorrencia registrada</w:t>
       </w:r>
     </w:p>
     <w:tbl>
@@ -2199,17 +2295,17 @@
               <w:rPr>
                 <w:sz w:val="18"/>
               </w:rPr>
-              <w:t>Administrador: clica na opcao 'Picking' no menu da tela principal</w:t>
-            </w:r>
-          </w:p>
-        </w:tc>
-        <w:tc>
-          <w:p>
-            <w:r>
-              <w:rPr>
-                <w:sz w:val="18"/>
-              </w:rPr>
-              <w:t>SYSTEM exibe lista de Ecommerces registrados no sistema</w:t>
+              <w:t>Administrador: clica na opcao 'Central de Operacoes' no menu da tela principal</w:t>
+            </w:r>
+          </w:p>
+        </w:tc>
+        <w:tc>
+          <w:p>
+            <w:r>
+              <w:rPr>
+                <w:sz w:val="18"/>
+              </w:rPr>
+              <w:t>SYSTEM exibe Dashboard do sistema</w:t>
             </w:r>
           </w:p>
         </w:tc>
@@ -2231,17 +2327,17 @@
               <w:rPr>
                 <w:sz w:val="18"/>
               </w:rPr>
-              <w:t>Administrador: clica em algum dos Ecommerces listados</w:t>
-            </w:r>
-          </w:p>
-        </w:tc>
-        <w:tc>
-          <w:p>
-            <w:r>
-              <w:rPr>
-                <w:sz w:val="18"/>
-              </w:rPr>
-              <w:t>SYSTEM abre uma tela com o Picking diario para aquele Ecommerce selecionado</w:t>
+              <w:t>Administrador: clica em contador 'Geradas' na secao de 'Coletas'</w:t>
+            </w:r>
+          </w:p>
+        </w:tc>
+        <w:tc>
+          <w:p>
+            <w:r>
+              <w:rPr>
+                <w:sz w:val="18"/>
+              </w:rPr>
+              <w:t>SYSTEM abre uma tela com as listas das 'Coletas'</w:t>
             </w:r>
           </w:p>
         </w:tc>
@@ -2263,17 +2359,17 @@
               <w:rPr>
                 <w:sz w:val="18"/>
               </w:rPr>
-              <w:t>Administrador: clica em botao 'Consultar Veiculos'</w:t>
-            </w:r>
-          </w:p>
-        </w:tc>
-        <w:tc>
-          <w:p>
-            <w:r>
-              <w:rPr>
-                <w:sz w:val="18"/>
-              </w:rPr>
-              <w:t>SYSTEM exibe lista de veiculos para picking</w:t>
+              <w:t>Administrador: ordena as Coletas por alguma coluna</w:t>
+            </w:r>
+          </w:p>
+        </w:tc>
+        <w:tc>
+          <w:p>
+            <w:r>
+              <w:rPr>
+                <w:sz w:val="18"/>
+              </w:rPr>
+              <w:t>SYSTEM abre uma tela com as listas das 'Coletas'</w:t>
             </w:r>
           </w:p>
         </w:tc>
@@ -2295,17 +2391,17 @@
               <w:rPr>
                 <w:sz w:val="18"/>
               </w:rPr>
-              <w:t>Administrador: clica em botao 'Iniciar Picking'</w:t>
-            </w:r>
-          </w:p>
-        </w:tc>
-        <w:tc>
-          <w:p>
-            <w:r>
-              <w:rPr>
-                <w:sz w:val="18"/>
-              </w:rPr>
-              <w:t>SYSTEM exibe os dados do Picking</w:t>
+              <w:t>Administrador: seleciona alguma Coleta da lista</w:t>
+            </w:r>
+          </w:p>
+        </w:tc>
+        <w:tc>
+          <w:p>
+            <w:r>
+              <w:rPr>
+                <w:sz w:val="18"/>
+              </w:rPr>
+              <w:t>SYSTEM exibe os dados da Coleta</w:t>
             </w:r>
           </w:p>
         </w:tc>
@@ -2327,17 +2423,1067 @@
               <w:rPr>
                 <w:sz w:val="18"/>
               </w:rPr>
-              <w:t>Administrador: clica no botao de 'Finalizar Picking'</w:t>
-            </w:r>
-          </w:p>
-        </w:tc>
-        <w:tc>
-          <w:p>
-            <w:r>
-              <w:rPr>
-                <w:sz w:val="18"/>
-              </w:rPr>
-              <w:t>SYSTEM notifica que Picking foi finalizado com sucesso e exibe Dashboard de sistema</w:t>
+              <w:t>Administrador: clica no botao de 'Registrar Ocorrencia' associado a qualquer item da nota</w:t>
+            </w:r>
+          </w:p>
+        </w:tc>
+        <w:tc>
+          <w:p>
+            <w:r>
+              <w:rPr>
+                <w:sz w:val="18"/>
+              </w:rPr>
+              <w:t>SYSTEM abre modal para digitacao da ocorrencia</w:t>
+            </w:r>
+          </w:p>
+        </w:tc>
+      </w:tr>
+      <w:tr>
+        <w:tc>
+          <w:p>
+            <w:r>
+              <w:rPr>
+                <w:sz w:val="18"/>
+              </w:rPr>
+              <w:t>6</w:t>
+            </w:r>
+          </w:p>
+        </w:tc>
+        <w:tc>
+          <w:p>
+            <w:r>
+              <w:rPr>
+                <w:sz w:val="18"/>
+              </w:rPr>
+              <w:t>Administrador: digita ocorrencia e clica em 'Confirmar'</w:t>
+            </w:r>
+          </w:p>
+        </w:tc>
+        <w:tc>
+          <w:p>
+            <w:r>
+              <w:rPr>
+                <w:sz w:val="18"/>
+              </w:rPr>
+              <w:t>SYSTEM notifica que Ocorrencia foi registrada com sucesso</w:t>
+            </w:r>
+          </w:p>
+        </w:tc>
+      </w:tr>
+    </w:tbl>
+    <w:p>
+      <w:r>
+        <w:br/>
+      </w:r>
+    </w:p>
+    <w:p>
+      <w:pPr>
+        <w:spacing w:before="180" w:after="60"/>
+      </w:pPr>
+      <w:r>
+        <w:rPr>
+          <w:b w:val="on"/>
+          <w:sz w:val="24"/>
+          <w:color w:val="2B6CB0"/>
+        </w:rPr>
+        <w:t>[TC9] Alternative Flow 8: Cancela registro de ocorrencia</w:t>
+      </w:r>
+    </w:p>
+    <w:p>
+      <w:pPr>
+        <w:spacing w:after="40"/>
+      </w:pPr>
+      <w:r>
+        <w:rPr>
+          <w:b w:val="on"/>
+          <w:sz w:val="20"/>
+        </w:rPr>
+        <w:t xml:space="preserve">Preconditions: </w:t>
+      </w:r>
+      <w:r>
+        <w:rPr>
+          <w:sz w:val="20"/>
+        </w:rPr>
+        <w:t>Usuario Administrador esta logado no sistema.</w:t>
+      </w:r>
+    </w:p>
+    <w:p>
+      <w:pPr>
+        <w:spacing w:after="40"/>
+      </w:pPr>
+      <w:r>
+        <w:rPr>
+          <w:b w:val="on"/>
+          <w:sz w:val="20"/>
+        </w:rPr>
+        <w:t xml:space="preserve">Postconditions: </w:t>
+      </w:r>
+      <w:r>
+        <w:rPr>
+          <w:sz w:val="20"/>
+        </w:rPr>
+        <w:t>A ocorrencia esta registrada e nota esta com status de ocorrencia registrada</w:t>
+      </w:r>
+    </w:p>
+    <w:tbl>
+      <w:tblPr>
+        <w:tblW w:w="5000" w:type="pct"/>
+        <w:tblBorders>
+          <w:top w:val="single"/>
+          <w:left w:val="single"/>
+          <w:bottom w:val="single"/>
+          <w:right w:val="single"/>
+          <w:insideH w:val="single"/>
+          <w:insideV w:val="single"/>
+        </w:tblBorders>
+      </w:tblPr>
+      <w:tr>
+        <w:tc>
+          <w:tcPr>
+            <w:tcW w:w="1200" w:type="dxa"/>
+            <w:shd w:color="auto" w:val="clear" w:fill="2B6CB0"/>
+          </w:tcPr>
+          <w:p>
+            <w:pPr>
+              <w:jc w:val="left"/>
+            </w:pPr>
+            <w:r>
+              <w:rPr>
+                <w:b w:val="on"/>
+                <w:sz w:val="20"/>
+                <w:color w:val="FFFFFF"/>
+              </w:rPr>
+              <w:t>Step #</w:t>
+            </w:r>
+          </w:p>
+        </w:tc>
+        <w:tc>
+          <w:tcPr>
+            <w:tcW w:w="4500" w:type="dxa"/>
+            <w:shd w:color="auto" w:val="clear" w:fill="2B6CB0"/>
+          </w:tcPr>
+          <w:p>
+            <w:pPr>
+              <w:jc w:val="left"/>
+            </w:pPr>
+            <w:r>
+              <w:rPr>
+                <w:b w:val="on"/>
+                <w:sz w:val="20"/>
+                <w:color w:val="FFFFFF"/>
+              </w:rPr>
+              <w:t>Actor Action</w:t>
+            </w:r>
+          </w:p>
+        </w:tc>
+        <w:tc>
+          <w:tcPr>
+            <w:tcW w:w="4500" w:type="dxa"/>
+            <w:shd w:color="auto" w:val="clear" w:fill="2B6CB0"/>
+          </w:tcPr>
+          <w:p>
+            <w:pPr>
+              <w:jc w:val="left"/>
+            </w:pPr>
+            <w:r>
+              <w:rPr>
+                <w:b w:val="on"/>
+                <w:sz w:val="20"/>
+                <w:color w:val="FFFFFF"/>
+              </w:rPr>
+              <w:t>Expected Result (System)</w:t>
+            </w:r>
+          </w:p>
+        </w:tc>
+      </w:tr>
+      <w:tr>
+        <w:tc>
+          <w:p>
+            <w:r>
+              <w:rPr>
+                <w:sz w:val="18"/>
+              </w:rPr>
+              <w:t>1</w:t>
+            </w:r>
+          </w:p>
+        </w:tc>
+        <w:tc>
+          <w:p>
+            <w:r>
+              <w:rPr>
+                <w:sz w:val="18"/>
+              </w:rPr>
+              <w:t>Administrador: clica na opcao 'Central de Operacoes' no menu da tela principal</w:t>
+            </w:r>
+          </w:p>
+        </w:tc>
+        <w:tc>
+          <w:p>
+            <w:r>
+              <w:rPr>
+                <w:sz w:val="18"/>
+              </w:rPr>
+              <w:t>SYSTEM exibe Dashboard do sistema</w:t>
+            </w:r>
+          </w:p>
+        </w:tc>
+      </w:tr>
+      <w:tr>
+        <w:tc>
+          <w:p>
+            <w:r>
+              <w:rPr>
+                <w:sz w:val="18"/>
+              </w:rPr>
+              <w:t>2</w:t>
+            </w:r>
+          </w:p>
+        </w:tc>
+        <w:tc>
+          <w:p>
+            <w:r>
+              <w:rPr>
+                <w:sz w:val="18"/>
+              </w:rPr>
+              <w:t>Administrador: clica em contador 'Geradas' na secao de 'Coletas'</w:t>
+            </w:r>
+          </w:p>
+        </w:tc>
+        <w:tc>
+          <w:p>
+            <w:r>
+              <w:rPr>
+                <w:sz w:val="18"/>
+              </w:rPr>
+              <w:t>SYSTEM abre uma tela com as listas das 'Coletas'</w:t>
+            </w:r>
+          </w:p>
+        </w:tc>
+      </w:tr>
+      <w:tr>
+        <w:tc>
+          <w:p>
+            <w:r>
+              <w:rPr>
+                <w:sz w:val="18"/>
+              </w:rPr>
+              <w:t>3</w:t>
+            </w:r>
+          </w:p>
+        </w:tc>
+        <w:tc>
+          <w:p>
+            <w:r>
+              <w:rPr>
+                <w:sz w:val="18"/>
+              </w:rPr>
+              <w:t>Administrador: seleciona alguma Coleta da lista</w:t>
+            </w:r>
+          </w:p>
+        </w:tc>
+        <w:tc>
+          <w:p>
+            <w:r>
+              <w:rPr>
+                <w:sz w:val="18"/>
+              </w:rPr>
+              <w:t>SYSTEM exibe os dados da Coleta</w:t>
+            </w:r>
+          </w:p>
+        </w:tc>
+      </w:tr>
+      <w:tr>
+        <w:tc>
+          <w:p>
+            <w:r>
+              <w:rPr>
+                <w:sz w:val="18"/>
+              </w:rPr>
+              <w:t>4</w:t>
+            </w:r>
+          </w:p>
+        </w:tc>
+        <w:tc>
+          <w:p>
+            <w:r>
+              <w:rPr>
+                <w:sz w:val="18"/>
+              </w:rPr>
+              <w:t>Administrador: clica no botao de 'Registrar Ocorrencia' associado a qualquer item da nota</w:t>
+            </w:r>
+          </w:p>
+        </w:tc>
+        <w:tc>
+          <w:p>
+            <w:r>
+              <w:rPr>
+                <w:sz w:val="18"/>
+              </w:rPr>
+              <w:t>SYSTEM abre modal para digitacao da ocorrencia</w:t>
+            </w:r>
+          </w:p>
+        </w:tc>
+      </w:tr>
+      <w:tr>
+        <w:tc>
+          <w:p>
+            <w:r>
+              <w:rPr>
+                <w:sz w:val="18"/>
+              </w:rPr>
+              <w:t>5</w:t>
+            </w:r>
+          </w:p>
+        </w:tc>
+        <w:tc>
+          <w:p>
+            <w:r>
+              <w:rPr>
+                <w:sz w:val="18"/>
+              </w:rPr>
+              <w:t>Administrador: clica em botao 'Cancelar'</w:t>
+            </w:r>
+          </w:p>
+        </w:tc>
+        <w:tc>
+          <w:p>
+            <w:r>
+              <w:rPr>
+                <w:sz w:val="18"/>
+              </w:rPr>
+              <w:t>SYSTEM exibe os dados da Coleta</w:t>
+            </w:r>
+          </w:p>
+        </w:tc>
+      </w:tr>
+      <w:tr>
+        <w:tc>
+          <w:p>
+            <w:r>
+              <w:rPr>
+                <w:sz w:val="18"/>
+              </w:rPr>
+              <w:t>6</w:t>
+            </w:r>
+          </w:p>
+        </w:tc>
+        <w:tc>
+          <w:p>
+            <w:r>
+              <w:rPr>
+                <w:sz w:val="18"/>
+              </w:rPr>
+              <w:t>Administrador: clica no botao de 'Registrar Ocorrencia' associado a qualquer item da nota</w:t>
+            </w:r>
+          </w:p>
+        </w:tc>
+        <w:tc>
+          <w:p>
+            <w:r>
+              <w:rPr>
+                <w:sz w:val="18"/>
+              </w:rPr>
+              <w:t>SYSTEM abre modal para digitacao da ocorrencia</w:t>
+            </w:r>
+          </w:p>
+        </w:tc>
+      </w:tr>
+      <w:tr>
+        <w:tc>
+          <w:p>
+            <w:r>
+              <w:rPr>
+                <w:sz w:val="18"/>
+              </w:rPr>
+              <w:t>7</w:t>
+            </w:r>
+          </w:p>
+        </w:tc>
+        <w:tc>
+          <w:p>
+            <w:r>
+              <w:rPr>
+                <w:sz w:val="18"/>
+              </w:rPr>
+              <w:t>Administrador: digita ocorrencia e clica em 'Confirmar'</w:t>
+            </w:r>
+          </w:p>
+        </w:tc>
+        <w:tc>
+          <w:p>
+            <w:r>
+              <w:rPr>
+                <w:sz w:val="18"/>
+              </w:rPr>
+              <w:t>SYSTEM notifica que Ocorrencia foi registrada com sucesso</w:t>
+            </w:r>
+          </w:p>
+        </w:tc>
+      </w:tr>
+    </w:tbl>
+    <w:p>
+      <w:r>
+        <w:br/>
+      </w:r>
+    </w:p>
+    <w:p>
+      <w:pPr>
+        <w:spacing w:before="180" w:after="60"/>
+      </w:pPr>
+      <w:r>
+        <w:rPr>
+          <w:b w:val="on"/>
+          <w:sz w:val="24"/>
+          <w:color w:val="2B6CB0"/>
+        </w:rPr>
+        <w:t>[TC10] Alternative Flow 9: Volta para lista de Coletas</w:t>
+      </w:r>
+    </w:p>
+    <w:p>
+      <w:pPr>
+        <w:spacing w:after="40"/>
+      </w:pPr>
+      <w:r>
+        <w:rPr>
+          <w:b w:val="on"/>
+          <w:sz w:val="20"/>
+        </w:rPr>
+        <w:t xml:space="preserve">Preconditions: </w:t>
+      </w:r>
+      <w:r>
+        <w:rPr>
+          <w:sz w:val="20"/>
+        </w:rPr>
+        <w:t>Usuario Administrador esta logado no sistema.</w:t>
+      </w:r>
+    </w:p>
+    <w:p>
+      <w:pPr>
+        <w:spacing w:after="40"/>
+      </w:pPr>
+      <w:r>
+        <w:rPr>
+          <w:b w:val="on"/>
+          <w:sz w:val="20"/>
+        </w:rPr>
+        <w:t xml:space="preserve">Postconditions: </w:t>
+      </w:r>
+      <w:r>
+        <w:rPr>
+          <w:sz w:val="20"/>
+        </w:rPr>
+        <w:t>A ocorrencia esta registrada e nota esta com status de ocorrencia registrada</w:t>
+      </w:r>
+    </w:p>
+    <w:tbl>
+      <w:tblPr>
+        <w:tblW w:w="5000" w:type="pct"/>
+        <w:tblBorders>
+          <w:top w:val="single"/>
+          <w:left w:val="single"/>
+          <w:bottom w:val="single"/>
+          <w:right w:val="single"/>
+          <w:insideH w:val="single"/>
+          <w:insideV w:val="single"/>
+        </w:tblBorders>
+      </w:tblPr>
+      <w:tr>
+        <w:tc>
+          <w:tcPr>
+            <w:tcW w:w="1200" w:type="dxa"/>
+            <w:shd w:color="auto" w:val="clear" w:fill="2B6CB0"/>
+          </w:tcPr>
+          <w:p>
+            <w:pPr>
+              <w:jc w:val="left"/>
+            </w:pPr>
+            <w:r>
+              <w:rPr>
+                <w:b w:val="on"/>
+                <w:sz w:val="20"/>
+                <w:color w:val="FFFFFF"/>
+              </w:rPr>
+              <w:t>Step #</w:t>
+            </w:r>
+          </w:p>
+        </w:tc>
+        <w:tc>
+          <w:tcPr>
+            <w:tcW w:w="4500" w:type="dxa"/>
+            <w:shd w:color="auto" w:val="clear" w:fill="2B6CB0"/>
+          </w:tcPr>
+          <w:p>
+            <w:pPr>
+              <w:jc w:val="left"/>
+            </w:pPr>
+            <w:r>
+              <w:rPr>
+                <w:b w:val="on"/>
+                <w:sz w:val="20"/>
+                <w:color w:val="FFFFFF"/>
+              </w:rPr>
+              <w:t>Actor Action</w:t>
+            </w:r>
+          </w:p>
+        </w:tc>
+        <w:tc>
+          <w:tcPr>
+            <w:tcW w:w="4500" w:type="dxa"/>
+            <w:shd w:color="auto" w:val="clear" w:fill="2B6CB0"/>
+          </w:tcPr>
+          <w:p>
+            <w:pPr>
+              <w:jc w:val="left"/>
+            </w:pPr>
+            <w:r>
+              <w:rPr>
+                <w:b w:val="on"/>
+                <w:sz w:val="20"/>
+                <w:color w:val="FFFFFF"/>
+              </w:rPr>
+              <w:t>Expected Result (System)</w:t>
+            </w:r>
+          </w:p>
+        </w:tc>
+      </w:tr>
+      <w:tr>
+        <w:tc>
+          <w:p>
+            <w:r>
+              <w:rPr>
+                <w:sz w:val="18"/>
+              </w:rPr>
+              <w:t>1</w:t>
+            </w:r>
+          </w:p>
+        </w:tc>
+        <w:tc>
+          <w:p>
+            <w:r>
+              <w:rPr>
+                <w:sz w:val="18"/>
+              </w:rPr>
+              <w:t>Administrador: clica na opcao 'Central de Operacoes' no menu da tela principal</w:t>
+            </w:r>
+          </w:p>
+        </w:tc>
+        <w:tc>
+          <w:p>
+            <w:r>
+              <w:rPr>
+                <w:sz w:val="18"/>
+              </w:rPr>
+              <w:t>SYSTEM exibe Dashboard do sistema</w:t>
+            </w:r>
+          </w:p>
+        </w:tc>
+      </w:tr>
+      <w:tr>
+        <w:tc>
+          <w:p>
+            <w:r>
+              <w:rPr>
+                <w:sz w:val="18"/>
+              </w:rPr>
+              <w:t>2</w:t>
+            </w:r>
+          </w:p>
+        </w:tc>
+        <w:tc>
+          <w:p>
+            <w:r>
+              <w:rPr>
+                <w:sz w:val="18"/>
+              </w:rPr>
+              <w:t>Administrador: clica em contador 'Geradas' na secao de 'Coletas'</w:t>
+            </w:r>
+          </w:p>
+        </w:tc>
+        <w:tc>
+          <w:p>
+            <w:r>
+              <w:rPr>
+                <w:sz w:val="18"/>
+              </w:rPr>
+              <w:t>SYSTEM abre uma tela com as listas das 'Coletas'</w:t>
+            </w:r>
+          </w:p>
+        </w:tc>
+      </w:tr>
+      <w:tr>
+        <w:tc>
+          <w:p>
+            <w:r>
+              <w:rPr>
+                <w:sz w:val="18"/>
+              </w:rPr>
+              <w:t>3</w:t>
+            </w:r>
+          </w:p>
+        </w:tc>
+        <w:tc>
+          <w:p>
+            <w:r>
+              <w:rPr>
+                <w:sz w:val="18"/>
+              </w:rPr>
+              <w:t>Administrador: seleciona alguma Coleta da lista</w:t>
+            </w:r>
+          </w:p>
+        </w:tc>
+        <w:tc>
+          <w:p>
+            <w:r>
+              <w:rPr>
+                <w:sz w:val="18"/>
+              </w:rPr>
+              <w:t>SYSTEM exibe os dados da Coleta</w:t>
+            </w:r>
+          </w:p>
+        </w:tc>
+      </w:tr>
+      <w:tr>
+        <w:tc>
+          <w:p>
+            <w:r>
+              <w:rPr>
+                <w:sz w:val="18"/>
+              </w:rPr>
+              <w:t>4</w:t>
+            </w:r>
+          </w:p>
+        </w:tc>
+        <w:tc>
+          <w:p>
+            <w:r>
+              <w:rPr>
+                <w:sz w:val="18"/>
+              </w:rPr>
+              <w:t>Administrador: clica no botao 'Voltar'</w:t>
+            </w:r>
+          </w:p>
+        </w:tc>
+        <w:tc>
+          <w:p>
+            <w:r>
+              <w:rPr>
+                <w:sz w:val="18"/>
+              </w:rPr>
+              <w:t>SYSTEM abre uma tela com as listas das 'Coletas'</w:t>
+            </w:r>
+          </w:p>
+        </w:tc>
+      </w:tr>
+      <w:tr>
+        <w:tc>
+          <w:p>
+            <w:r>
+              <w:rPr>
+                <w:sz w:val="18"/>
+              </w:rPr>
+              <w:t>5</w:t>
+            </w:r>
+          </w:p>
+        </w:tc>
+        <w:tc>
+          <w:p>
+            <w:r>
+              <w:rPr>
+                <w:sz w:val="18"/>
+              </w:rPr>
+              <w:t>Administrador: seleciona alguma Coleta da lista</w:t>
+            </w:r>
+          </w:p>
+        </w:tc>
+        <w:tc>
+          <w:p>
+            <w:r>
+              <w:rPr>
+                <w:sz w:val="18"/>
+              </w:rPr>
+              <w:t>SYSTEM exibe os dados da Coleta</w:t>
+            </w:r>
+          </w:p>
+        </w:tc>
+      </w:tr>
+      <w:tr>
+        <w:tc>
+          <w:p>
+            <w:r>
+              <w:rPr>
+                <w:sz w:val="18"/>
+              </w:rPr>
+              <w:t>6</w:t>
+            </w:r>
+          </w:p>
+        </w:tc>
+        <w:tc>
+          <w:p>
+            <w:r>
+              <w:rPr>
+                <w:sz w:val="18"/>
+              </w:rPr>
+              <w:t>Administrador: clica no botao de 'Registrar Ocorrencia' associado a qualquer item da nota</w:t>
+            </w:r>
+          </w:p>
+        </w:tc>
+        <w:tc>
+          <w:p>
+            <w:r>
+              <w:rPr>
+                <w:sz w:val="18"/>
+              </w:rPr>
+              <w:t>SYSTEM abre modal para digitacao da ocorrencia</w:t>
+            </w:r>
+          </w:p>
+        </w:tc>
+      </w:tr>
+      <w:tr>
+        <w:tc>
+          <w:p>
+            <w:r>
+              <w:rPr>
+                <w:sz w:val="18"/>
+              </w:rPr>
+              <w:t>7</w:t>
+            </w:r>
+          </w:p>
+        </w:tc>
+        <w:tc>
+          <w:p>
+            <w:r>
+              <w:rPr>
+                <w:sz w:val="18"/>
+              </w:rPr>
+              <w:t>Administrador: digita ocorrencia e clica em 'Confirmar'</w:t>
+            </w:r>
+          </w:p>
+        </w:tc>
+        <w:tc>
+          <w:p>
+            <w:r>
+              <w:rPr>
+                <w:sz w:val="18"/>
+              </w:rPr>
+              <w:t>SYSTEM notifica que Ocorrencia foi registrada com sucesso</w:t>
+            </w:r>
+          </w:p>
+        </w:tc>
+      </w:tr>
+    </w:tbl>
+    <w:p>
+      <w:r>
+        <w:br/>
+      </w:r>
+    </w:p>
+    <w:p>
+      <w:pPr>
+        <w:spacing w:before="180" w:after="60"/>
+      </w:pPr>
+      <w:r>
+        <w:rPr>
+          <w:b w:val="on"/>
+          <w:sz w:val="24"/>
+          <w:color w:val="2B6CB0"/>
+        </w:rPr>
+        <w:t>[TC11] Alternative Flow 10: Filtra coletas da lista</w:t>
+      </w:r>
+    </w:p>
+    <w:p>
+      <w:pPr>
+        <w:spacing w:after="40"/>
+      </w:pPr>
+      <w:r>
+        <w:rPr>
+          <w:b w:val="on"/>
+          <w:sz w:val="20"/>
+        </w:rPr>
+        <w:t xml:space="preserve">Preconditions: </w:t>
+      </w:r>
+      <w:r>
+        <w:rPr>
+          <w:sz w:val="20"/>
+        </w:rPr>
+        <w:t>Usuario Administrador esta logado no sistema.</w:t>
+      </w:r>
+    </w:p>
+    <w:p>
+      <w:pPr>
+        <w:spacing w:after="40"/>
+      </w:pPr>
+      <w:r>
+        <w:rPr>
+          <w:b w:val="on"/>
+          <w:sz w:val="20"/>
+        </w:rPr>
+        <w:t xml:space="preserve">Postconditions: </w:t>
+      </w:r>
+      <w:r>
+        <w:rPr>
+          <w:sz w:val="20"/>
+        </w:rPr>
+        <w:t>A ocorrencia esta registrada e nota esta com status de ocorrencia registrada</w:t>
+      </w:r>
+    </w:p>
+    <w:tbl>
+      <w:tblPr>
+        <w:tblW w:w="5000" w:type="pct"/>
+        <w:tblBorders>
+          <w:top w:val="single"/>
+          <w:left w:val="single"/>
+          <w:bottom w:val="single"/>
+          <w:right w:val="single"/>
+          <w:insideH w:val="single"/>
+          <w:insideV w:val="single"/>
+        </w:tblBorders>
+      </w:tblPr>
+      <w:tr>
+        <w:tc>
+          <w:tcPr>
+            <w:tcW w:w="1200" w:type="dxa"/>
+            <w:shd w:color="auto" w:val="clear" w:fill="2B6CB0"/>
+          </w:tcPr>
+          <w:p>
+            <w:pPr>
+              <w:jc w:val="left"/>
+            </w:pPr>
+            <w:r>
+              <w:rPr>
+                <w:b w:val="on"/>
+                <w:sz w:val="20"/>
+                <w:color w:val="FFFFFF"/>
+              </w:rPr>
+              <w:t>Step #</w:t>
+            </w:r>
+          </w:p>
+        </w:tc>
+        <w:tc>
+          <w:tcPr>
+            <w:tcW w:w="4500" w:type="dxa"/>
+            <w:shd w:color="auto" w:val="clear" w:fill="2B6CB0"/>
+          </w:tcPr>
+          <w:p>
+            <w:pPr>
+              <w:jc w:val="left"/>
+            </w:pPr>
+            <w:r>
+              <w:rPr>
+                <w:b w:val="on"/>
+                <w:sz w:val="20"/>
+                <w:color w:val="FFFFFF"/>
+              </w:rPr>
+              <w:t>Actor Action</w:t>
+            </w:r>
+          </w:p>
+        </w:tc>
+        <w:tc>
+          <w:tcPr>
+            <w:tcW w:w="4500" w:type="dxa"/>
+            <w:shd w:color="auto" w:val="clear" w:fill="2B6CB0"/>
+          </w:tcPr>
+          <w:p>
+            <w:pPr>
+              <w:jc w:val="left"/>
+            </w:pPr>
+            <w:r>
+              <w:rPr>
+                <w:b w:val="on"/>
+                <w:sz w:val="20"/>
+                <w:color w:val="FFFFFF"/>
+              </w:rPr>
+              <w:t>Expected Result (System)</w:t>
+            </w:r>
+          </w:p>
+        </w:tc>
+      </w:tr>
+      <w:tr>
+        <w:tc>
+          <w:p>
+            <w:r>
+              <w:rPr>
+                <w:sz w:val="18"/>
+              </w:rPr>
+              <w:t>1</w:t>
+            </w:r>
+          </w:p>
+        </w:tc>
+        <w:tc>
+          <w:p>
+            <w:r>
+              <w:rPr>
+                <w:sz w:val="18"/>
+              </w:rPr>
+              <w:t>Administrador: clica na opcao 'Central de Operacoes' no menu da tela principal</w:t>
+            </w:r>
+          </w:p>
+        </w:tc>
+        <w:tc>
+          <w:p>
+            <w:r>
+              <w:rPr>
+                <w:sz w:val="18"/>
+              </w:rPr>
+              <w:t>SYSTEM exibe Dashboard do sistema</w:t>
+            </w:r>
+          </w:p>
+        </w:tc>
+      </w:tr>
+      <w:tr>
+        <w:tc>
+          <w:p>
+            <w:r>
+              <w:rPr>
+                <w:sz w:val="18"/>
+              </w:rPr>
+              <w:t>2</w:t>
+            </w:r>
+          </w:p>
+        </w:tc>
+        <w:tc>
+          <w:p>
+            <w:r>
+              <w:rPr>
+                <w:sz w:val="18"/>
+              </w:rPr>
+              <w:t>Administrador: clica em contador 'Geradas' na secao de 'Coletas'</w:t>
+            </w:r>
+          </w:p>
+        </w:tc>
+        <w:tc>
+          <w:p>
+            <w:r>
+              <w:rPr>
+                <w:sz w:val="18"/>
+              </w:rPr>
+              <w:t>SYSTEM abre uma tela com as listas das 'Coletas'</w:t>
+            </w:r>
+          </w:p>
+        </w:tc>
+      </w:tr>
+      <w:tr>
+        <w:tc>
+          <w:p>
+            <w:r>
+              <w:rPr>
+                <w:sz w:val="18"/>
+              </w:rPr>
+              <w:t>3</w:t>
+            </w:r>
+          </w:p>
+        </w:tc>
+        <w:tc>
+          <w:p>
+            <w:r>
+              <w:rPr>
+                <w:sz w:val="18"/>
+              </w:rPr>
+              <w:t>Administrador: filtra as coletas por algum campo</w:t>
+            </w:r>
+          </w:p>
+        </w:tc>
+        <w:tc>
+          <w:p>
+            <w:r>
+              <w:rPr>
+                <w:sz w:val="18"/>
+              </w:rPr>
+              <w:t>SYSTEM abre uma tela com as listas das 'Coletas'</w:t>
+            </w:r>
+          </w:p>
+        </w:tc>
+      </w:tr>
+      <w:tr>
+        <w:tc>
+          <w:p>
+            <w:r>
+              <w:rPr>
+                <w:sz w:val="18"/>
+              </w:rPr>
+              <w:t>4</w:t>
+            </w:r>
+          </w:p>
+        </w:tc>
+        <w:tc>
+          <w:p>
+            <w:r>
+              <w:rPr>
+                <w:sz w:val="18"/>
+              </w:rPr>
+              <w:t>Administrador: seleciona alguma Coleta da lista</w:t>
+            </w:r>
+          </w:p>
+        </w:tc>
+        <w:tc>
+          <w:p>
+            <w:r>
+              <w:rPr>
+                <w:sz w:val="18"/>
+              </w:rPr>
+              <w:t>SYSTEM exibe os dados da Coleta</w:t>
+            </w:r>
+          </w:p>
+        </w:tc>
+      </w:tr>
+      <w:tr>
+        <w:tc>
+          <w:p>
+            <w:r>
+              <w:rPr>
+                <w:sz w:val="18"/>
+              </w:rPr>
+              <w:t>5</w:t>
+            </w:r>
+          </w:p>
+        </w:tc>
+        <w:tc>
+          <w:p>
+            <w:r>
+              <w:rPr>
+                <w:sz w:val="18"/>
+              </w:rPr>
+              <w:t>Administrador: clica no botao de 'Registrar Ocorrencia' associado a qualquer item da nota</w:t>
+            </w:r>
+          </w:p>
+        </w:tc>
+        <w:tc>
+          <w:p>
+            <w:r>
+              <w:rPr>
+                <w:sz w:val="18"/>
+              </w:rPr>
+              <w:t>SYSTEM abre modal para digitacao da ocorrencia</w:t>
+            </w:r>
+          </w:p>
+        </w:tc>
+      </w:tr>
+      <w:tr>
+        <w:tc>
+          <w:p>
+            <w:r>
+              <w:rPr>
+                <w:sz w:val="18"/>
+              </w:rPr>
+              <w:t>6</w:t>
+            </w:r>
+          </w:p>
+        </w:tc>
+        <w:tc>
+          <w:p>
+            <w:r>
+              <w:rPr>
+                <w:sz w:val="18"/>
+              </w:rPr>
+              <w:t>Administrador: digita ocorrencia e clica em 'Confirmar'</w:t>
+            </w:r>
+          </w:p>
+        </w:tc>
+        <w:tc>
+          <w:p>
+            <w:r>
+              <w:rPr>
+                <w:sz w:val="18"/>
+              </w:rPr>
+              <w:t>SYSTEM notifica que Ocorrencia foi registrada com sucesso</w:t>
             </w:r>
           </w:p>
         </w:tc>

</xml_diff>